<commit_message>
chore(rc1): finalize production certification and deployment verification
- Complete reporting period architecture migration
- Verify production deployment integrity
- Deploy and verify Edge Functions
- Verify production scheduler
- Verify environment configuration
- Verify RLS, authentication, and storage
- Complete production smoke tests
- Add RC-1 deployment documentation
- Prepare for production onboarding
</commit_message>
<xml_diff>
--- a/docs/enterprise-accounts-production/V15.0/evidence/AFS_V15_Composition_Demo.docx
+++ b/docs/enterprise-accounts-production/V15.0/evidence/AFS_V15_Composition_Demo.docx
@@ -1481,7 +1481,7 @@
                 <w:sz w:val="18"/>
                 <w:szCs w:val="18"/>
               </w:rPr>
-              <w:t xml:space="preserve">Year ended 31 March 2026</w:t>
+              <w:t xml:space="preserve">FY2026</w:t>
             </w:r>
           </w:p>
         </w:tc>
@@ -18789,7 +18789,7 @@
         <w:sz w:val="16"/>
         <w:szCs w:val="16"/>
       </w:rPr>
-      <w:t xml:space="preserve">   29 July 2026</w:t>
+      <w:t xml:space="preserve">   30 July 2026</w:t>
     </w:r>
   </w:p>
 </w:ftr>

</xml_diff>